<commit_message>
feat(invoice): add correspondent bank BIC for USD wires
Add an optional correspondentBic field to the bank model and render it on
invoices (default template + label), so USD-denominated accounts that require
an intermediary bank can show it. Only renders when the account provides one,
leaving other accounts unchanged.
</commit_message>
<xml_diff>
--- a/templates/default.docx
+++ b/templates/default.docx
@@ -883,6 +883,25 @@
           <w:szCs w:val="20"/>
         </w:rPr>
         <w:t xml:space="preserve">{bank.bic}</w:t>
+      </w:r>
+    </w:p>
+    <w:p>
+      <w:pPr>
+        <w:spacing w:after="40"/>
+      </w:pPr>
+      <w:r>
+        <w:rPr>
+          <w:sz w:val="20"/>
+          <w:szCs w:val="20"/>
+        </w:rPr>
+        <w:t xml:space="preserve">{#bank.correspondentBic}{translations.correspondentBic} </w:t>
+      </w:r>
+      <w:r>
+        <w:rPr>
+          <w:sz w:val="20"/>
+          <w:szCs w:val="20"/>
+        </w:rPr>
+        <w:t xml:space="preserve">{bank.correspondentBic}{/bank.correspondentBic}</w:t>
       </w:r>
     </w:p>
     <w:p>

</xml_diff>